<commit_message>
chore: update scores snapshot (2026-07-11 15:54)
</commit_message>
<xml_diff>
--- a/docs/開發日誌_DevLog.docx
+++ b/docs/開發日誌_DevLog.docx
@@ -2,7 +2,7 @@
 <file path=word/document.xml><?xml version="1.0" encoding="utf-8"?>
 <w:document xmlns:w="http://schemas.openxmlformats.org/wordprocessingml/2006/main" xmlns:m="http://schemas.openxmlformats.org/officeDocument/2006/math" xmlns:r="http://schemas.openxmlformats.org/officeDocument/2006/relationships" xmlns:o="urn:schemas-microsoft-com:office:office" xmlns:v="urn:schemas-microsoft-com:vml" xmlns:w10="urn:schemas-microsoft-com:office:word" xmlns:a="http://schemas.openxmlformats.org/drawingml/2006/main" xmlns:pic="http://schemas.openxmlformats.org/drawingml/2006/picture" xmlns:wp="http://schemas.openxmlformats.org/drawingml/2006/wordprocessingDrawing">
   <w:body>
-    <w:bookmarkStart w:id="59" w:name="X8b4ddd03623843e3745ff62ee27f035c94830ac"/>
+    <w:bookmarkStart w:id="63" w:name="X8b4ddd03623843e3745ff62ee27f035c94830ac"/>
     <w:p>
       <w:pPr>
         <w:pStyle w:val="Heading1"/>
@@ -173,6 +173,74 @@
       </w:r>
       <w:r>
         <w:t xml:space="preserve">。</w:t>
+      </w:r>
+      <w:r>
+        <w:t xml:space="preserve"> </w:t>
+      </w:r>
+      <w:r>
+        <w:rPr>
+          <w:bCs/>
+          <w:b/>
+        </w:rPr>
+        <w:t xml:space="preserve">v4.1 新增</w:t>
+      </w:r>
+      <w:r>
+        <w:t xml:space="preserve">：</w:t>
+      </w:r>
+      <w:r>
+        <w:rPr>
+          <w:bCs/>
+          <w:b/>
+        </w:rPr>
+        <w:t xml:space="preserve">上手文件與使用說明大幅強化</w:t>
+      </w:r>
+      <w:r>
+        <w:t xml:space="preserve">（FinMind token 取得步驟、每檔 API 用量與建議搜尋檔數、</w:t>
+      </w:r>
+      <w:r>
+        <w:t xml:space="preserve"> </w:t>
+      </w:r>
+      <w:r>
+        <w:t xml:space="preserve">綜合分選股與自選名單</w:t>
+      </w:r>
+      <w:r>
+        <w:t xml:space="preserve"> </w:t>
+      </w:r>
+      <w:r>
+        <w:rPr>
+          <w:rStyle w:val="VerbatimChar"/>
+        </w:rPr>
+        <w:t xml:space="preserve">watchlist.txt</w:t>
+      </w:r>
+      <w:r>
+        <w:t xml:space="preserve"> </w:t>
+      </w:r>
+      <w:r>
+        <w:t xml:space="preserve">說明）、</w:t>
+      </w:r>
+      <w:r>
+        <w:rPr>
+          <w:rStyle w:val="VerbatimChar"/>
+        </w:rPr>
+        <w:t xml:space="preserve">push_app.bat</w:t>
+      </w:r>
+      <w:r>
+        <w:t xml:space="preserve"> </w:t>
+      </w:r>
+      <w:r>
+        <w:t xml:space="preserve">一鍵推程式碼、</w:t>
+      </w:r>
+      <w:r>
+        <w:rPr>
+          <w:rStyle w:val="VerbatimChar"/>
+        </w:rPr>
+        <w:t xml:space="preserve">USER_GUIDE</w:t>
+      </w:r>
+      <w:r>
+        <w:t xml:space="preserve"> </w:t>
+      </w:r>
+      <w:r>
+        <w:t xml:space="preserve">改版並輸出 Word 版。</w:t>
       </w:r>
     </w:p>
     <w:p>
@@ -352,7 +420,24 @@
         </w:numPr>
         <w:pStyle w:val="Compact"/>
       </w:pPr>
-      <w:hyperlink w:anchor="X17e2b4171b5480454f1859d86f9d48f9c3bbcd5">
+      <w:hyperlink w:anchor="Xbb6526aad10d5fac43a5fc70bededbf54070df6">
+        <w:r>
+          <w:rPr>
+            <w:rStyle w:val="Hyperlink"/>
+          </w:rPr>
+          <w:t xml:space="preserve">v4.1 — 上手文件與使用說明強化</w:t>
+        </w:r>
+      </w:hyperlink>
+    </w:p>
+    <w:p>
+      <w:pPr>
+        <w:numPr>
+          <w:ilvl w:val="0"/>
+          <w:numId w:val="1001"/>
+        </w:numPr>
+        <w:pStyle w:val="Compact"/>
+      </w:pPr>
+      <w:hyperlink w:anchor="X18d5a40128576ee9820ff8c3579b771c95d9c7b">
         <w:r>
           <w:rPr>
             <w:rStyle w:val="Hyperlink"/>
@@ -369,7 +454,7 @@
         </w:numPr>
         <w:pStyle w:val="Compact"/>
       </w:pPr>
-      <w:hyperlink w:anchor="Xd32ff49cbee2cf28b41dd7519abdc35e48b8c1a">
+      <w:hyperlink w:anchor="Xab4794422d134a2f38c85077f9534c871ee3377">
         <w:r>
           <w:rPr>
             <w:rStyle w:val="Hyperlink"/>
@@ -386,7 +471,7 @@
         </w:numPr>
         <w:pStyle w:val="Compact"/>
       </w:pPr>
-      <w:hyperlink w:anchor="X26866916ce29e77f52c19cbea02ecf7c8ee51fb">
+      <w:hyperlink w:anchor="X9785cd63c1be2ad500c0f8d5dc148f70f0dfead">
         <w:r>
           <w:rPr>
             <w:rStyle w:val="Hyperlink"/>
@@ -1675,6 +1760,82 @@
                 <w:b/>
               </w:rPr>
               <w:t xml:space="preserve">可跨股選股、且能公開部署的網站</w:t>
+            </w:r>
+          </w:p>
+        </w:tc>
+      </w:tr>
+      <w:tr>
+        <w:tc>
+          <w:tcPr/>
+          <w:p>
+            <w:pPr>
+              <w:pStyle w:val="Compact"/>
+              <w:jc w:val="left"/>
+            </w:pPr>
+            <w:r>
+              <w:rPr>
+                <w:bCs/>
+                <w:b/>
+              </w:rPr>
+              <w:t xml:space="preserve">v4.1</w:t>
+            </w:r>
+          </w:p>
+        </w:tc>
+        <w:tc>
+          <w:tcPr/>
+          <w:p>
+            <w:pPr>
+              <w:pStyle w:val="Compact"/>
+              <w:jc w:val="left"/>
+            </w:pPr>
+            <w:r>
+              <w:t xml:space="preserve">上手文件強化</w:t>
+            </w:r>
+          </w:p>
+        </w:tc>
+        <w:tc>
+          <w:tcPr/>
+          <w:p>
+            <w:pPr>
+              <w:pStyle w:val="Compact"/>
+              <w:jc w:val="left"/>
+            </w:pPr>
+            <w:r>
+              <w:t xml:space="preserve">使用說明補 FinMind token 取得、每檔 API 用量/建議檔數、綜合分選股與名單說明；</w:t>
+            </w:r>
+            <w:r>
+              <w:rPr>
+                <w:rStyle w:val="VerbatimChar"/>
+              </w:rPr>
+              <w:t xml:space="preserve">push_app.bat</w:t>
+            </w:r>
+            <w:r>
+              <w:t xml:space="preserve"> </w:t>
+            </w:r>
+            <w:r>
+              <w:t xml:space="preserve">一鍵推程式碼；USER_GUIDE 改版 + Word 版</w:t>
+            </w:r>
+          </w:p>
+        </w:tc>
+        <w:tc>
+          <w:tcPr/>
+          <w:p>
+            <w:pPr>
+              <w:pStyle w:val="Compact"/>
+              <w:jc w:val="left"/>
+            </w:pPr>
+            <w:r>
+              <w:t xml:space="preserve">由「能用的網站」→</w:t>
+            </w:r>
+            <w:r>
+              <w:t xml:space="preserve"> </w:t>
+            </w:r>
+            <w:r>
+              <w:rPr>
+                <w:bCs/>
+                <w:b/>
+              </w:rPr>
+              <w:t xml:space="preserve">新手看說明就能自行上手</w:t>
             </w:r>
           </w:p>
         </w:tc>
@@ -6892,13 +7053,501 @@
     </w:p>
     <w:bookmarkEnd w:id="50"/>
     <w:bookmarkEnd w:id="51"/>
-    <w:bookmarkStart w:id="52" w:name="X17e2b4171b5480454f1859d86f9d48f9c3bbcd5"/>
+    <w:bookmarkStart w:id="55" w:name="Xbb6526aad10d5fac43a5fc70bededbf54070df6"/>
     <w:p>
       <w:pPr>
         <w:pStyle w:val="Heading2"/>
       </w:pPr>
       <w:r>
-        <w:t xml:space="preserve">10. 📈 關鍵指標演進總表</w:t>
+        <w:t xml:space="preserve">10. 🧭 v4.1 — 上手文件與使用說明強化</w:t>
+      </w:r>
+    </w:p>
+    <w:p>
+      <w:pPr>
+        <w:pStyle w:val="FirstParagraph"/>
+      </w:pPr>
+      <w:r>
+        <w:t xml:space="preserve">v4.0 讓「別人打開瀏覽器就能用」；v4.1 補上最後一哩：</w:t>
+      </w:r>
+      <w:r>
+        <w:rPr>
+          <w:bCs/>
+          <w:b/>
+        </w:rPr>
+        <w:t xml:space="preserve">讓沒接觸過的人光看說明就能自己上手</w:t>
+      </w:r>
+      <w:r>
+        <w:t xml:space="preserve">，</w:t>
+      </w:r>
+      <w:r>
+        <w:t xml:space="preserve"> </w:t>
+      </w:r>
+      <w:r>
+        <w:t xml:space="preserve">不必問作者怎麼拿 token、一次能查幾檔、選股分頁到底在做什麼。此版</w:t>
+      </w:r>
+      <w:r>
+        <w:rPr>
+          <w:bCs/>
+          <w:b/>
+        </w:rPr>
+        <w:t xml:space="preserve">不動策略與引擎邏輯</w:t>
+      </w:r>
+      <w:r>
+        <w:t xml:space="preserve">，純粹強化「怎麼用」。</w:t>
+      </w:r>
+    </w:p>
+    <w:bookmarkStart w:id="52" w:name="a-網頁-使用說明分頁大幅擴充apppy"/>
+    <w:p>
+      <w:pPr>
+        <w:pStyle w:val="Heading3"/>
+      </w:pPr>
+      <w:r>
+        <w:t xml:space="preserve">A. 網頁「📖 使用說明」分頁大幅擴充（</w:t>
+      </w:r>
+      <w:r>
+        <w:rPr>
+          <w:rStyle w:val="VerbatimChar"/>
+        </w:rPr>
+        <w:t xml:space="preserve">app.py</w:t>
+      </w:r>
+      <w:r>
+        <w:t xml:space="preserve">）</w:t>
+      </w:r>
+    </w:p>
+    <w:p>
+      <w:pPr>
+        <w:numPr>
+          <w:ilvl w:val="0"/>
+          <w:numId w:val="1020"/>
+        </w:numPr>
+        <w:pStyle w:val="Compact"/>
+      </w:pPr>
+      <w:r>
+        <w:rPr>
+          <w:bCs/>
+          <w:b/>
+        </w:rPr>
+        <w:t xml:space="preserve">FinMind API token 取得教學</w:t>
+      </w:r>
+      <w:r>
+        <w:t xml:space="preserve">：官網網址、Email 註冊 → 收信驗證 → 會員中心複製</w:t>
+      </w:r>
+      <w:r>
+        <w:t xml:space="preserve"> </w:t>
+      </w:r>
+      <w:r>
+        <w:rPr>
+          <w:rStyle w:val="VerbatimChar"/>
+        </w:rPr>
+        <w:t xml:space="preserve">api_token</w:t>
+      </w:r>
+      <w:r>
+        <w:t xml:space="preserve"> </w:t>
+      </w:r>
+      <w:r>
+        <w:t xml:space="preserve">→ 貼到側欄的完整五步驟；</w:t>
+      </w:r>
+      <w:r>
+        <w:t xml:space="preserve"> </w:t>
+      </w:r>
+      <w:r>
+        <w:t xml:space="preserve">附額度說明（匿名極低 / 免費註冊會員每小時約 600 次 / 贊助方案更高）與常見問題（貼了抓不到、代號怎麼填、不想註冊改用選股分頁）。</w:t>
+      </w:r>
+    </w:p>
+    <w:p>
+      <w:pPr>
+        <w:numPr>
+          <w:ilvl w:val="0"/>
+          <w:numId w:val="1020"/>
+        </w:numPr>
+        <w:pStyle w:val="Compact"/>
+      </w:pPr>
+      <w:r>
+        <w:rPr>
+          <w:bCs/>
+          <w:b/>
+        </w:rPr>
+        <w:t xml:space="preserve">每檔 API 用量與建議搜尋檔數</w:t>
+      </w:r>
+      <w:r>
+        <w:t xml:space="preserve">：點明每分析一檔</w:t>
+      </w:r>
+      <w:r>
+        <w:rPr>
+          <w:bCs/>
+          <w:b/>
+        </w:rPr>
+        <w:t xml:space="preserve">全新股票</w:t>
+      </w:r>
+      <w:r>
+        <w:t xml:space="preserve">約打</w:t>
+      </w:r>
+      <w:r>
+        <w:t xml:space="preserve"> </w:t>
+      </w:r>
+      <w:r>
+        <w:rPr>
+          <w:bCs/>
+          <w:b/>
+        </w:rPr>
+        <w:t xml:space="preserve">9 支 FinMind 請求</w:t>
+      </w:r>
+      <w:r>
+        <w:t xml:space="preserve">（股價 / 法人買賣超 / 流通股 / 融資融券 /</w:t>
+      </w:r>
+      <w:r>
+        <w:t xml:space="preserve"> </w:t>
+      </w:r>
+      <w:r>
+        <w:t xml:space="preserve">月營收 / PER 河流圖 / 損益表 / 資產負債表 / 現金流量表），快取命中後幾乎 0；以每小時 600 次估算，建議</w:t>
+      </w:r>
+      <w:r>
+        <w:t xml:space="preserve"> </w:t>
+      </w:r>
+      <w:r>
+        <w:rPr>
+          <w:bCs/>
+          <w:b/>
+        </w:rPr>
+        <w:t xml:space="preserve">個股分析 1~5 檔、多檔排行 ≤ 20~30 檔、大量掃描改用綜合分選股（0 API）</w:t>
+      </w:r>
+      <w:r>
+        <w:t xml:space="preserve">。</w:t>
+      </w:r>
+    </w:p>
+    <w:p>
+      <w:pPr>
+        <w:numPr>
+          <w:ilvl w:val="0"/>
+          <w:numId w:val="1020"/>
+        </w:numPr>
+        <w:pStyle w:val="Compact"/>
+      </w:pPr>
+      <w:r>
+        <w:rPr>
+          <w:bCs/>
+          <w:b/>
+        </w:rPr>
+        <w:t xml:space="preserve">綜合分選股使用說明</w:t>
+      </w:r>
+      <w:r>
+        <w:t xml:space="preserve">：操作三步驟、綜合分 / 百分位等欄位意義、「</w:t>
+      </w:r>
+      <w:r>
+        <w:rPr>
+          <w:bCs/>
+          <w:b/>
+        </w:rPr>
+        <w:t xml:space="preserve">快照非即時</w:t>
+      </w:r>
+      <w:r>
+        <w:t xml:space="preserve">」提醒，</w:t>
+      </w:r>
+      <w:r>
+        <w:t xml:space="preserve"> </w:t>
+      </w:r>
+      <w:r>
+        <w:t xml:space="preserve">以及自選名單</w:t>
+      </w:r>
+      <w:r>
+        <w:t xml:space="preserve"> </w:t>
+      </w:r>
+      <w:r>
+        <w:rPr>
+          <w:rStyle w:val="VerbatimChar"/>
+        </w:rPr>
+        <w:t xml:space="preserve">watchlist.txt</w:t>
+      </w:r>
+      <w:r>
+        <w:t xml:space="preserve"> </w:t>
+      </w:r>
+      <w:r>
+        <w:t xml:space="preserve">由使用者控制、</w:t>
+      </w:r>
+      <w:r>
+        <w:rPr>
+          <w:bCs/>
+          <w:b/>
+        </w:rPr>
+        <w:t xml:space="preserve">線上版需「重算 + 上傳」才更新</w:t>
+      </w:r>
+      <w:r>
+        <w:t xml:space="preserve">的說明。</w:t>
+      </w:r>
+    </w:p>
+    <w:bookmarkEnd w:id="52"/>
+    <w:bookmarkStart w:id="53" w:name="b-一鍵推程式碼-push_appbat新增"/>
+    <w:p>
+      <w:pPr>
+        <w:pStyle w:val="Heading3"/>
+      </w:pPr>
+      <w:r>
+        <w:t xml:space="preserve">B. 一鍵推程式碼</w:t>
+      </w:r>
+      <w:r>
+        <w:t xml:space="preserve"> </w:t>
+      </w:r>
+      <w:r>
+        <w:rPr>
+          <w:rStyle w:val="VerbatimChar"/>
+        </w:rPr>
+        <w:t xml:space="preserve">push_app.bat</w:t>
+      </w:r>
+      <w:r>
+        <w:t xml:space="preserve">（新增）</w:t>
+      </w:r>
+    </w:p>
+    <w:p>
+      <w:pPr>
+        <w:numPr>
+          <w:ilvl w:val="0"/>
+          <w:numId w:val="1021"/>
+        </w:numPr>
+        <w:pStyle w:val="Compact"/>
+      </w:pPr>
+      <w:r>
+        <w:t xml:space="preserve">既有</w:t>
+      </w:r>
+      <w:r>
+        <w:t xml:space="preserve"> </w:t>
+      </w:r>
+      <w:r>
+        <w:rPr>
+          <w:rStyle w:val="VerbatimChar"/>
+        </w:rPr>
+        <w:t xml:space="preserve">update_and_push.bat</w:t>
+      </w:r>
+      <w:r>
+        <w:t xml:space="preserve">（→</w:t>
+      </w:r>
+      <w:r>
+        <w:t xml:space="preserve"> </w:t>
+      </w:r>
+      <w:r>
+        <w:rPr>
+          <w:rStyle w:val="VerbatimChar"/>
+        </w:rPr>
+        <w:t xml:space="preserve">deploy_scores.py</w:t>
+      </w:r>
+      <w:r>
+        <w:t xml:space="preserve">）只提交</w:t>
+      </w:r>
+      <w:r>
+        <w:t xml:space="preserve"> </w:t>
+      </w:r>
+      <w:r>
+        <w:rPr>
+          <w:rStyle w:val="VerbatimChar"/>
+        </w:rPr>
+        <w:t xml:space="preserve">cloud_cache/Scores</w:t>
+      </w:r>
+      <w:r>
+        <w:t xml:space="preserve"> </w:t>
+      </w:r>
+      <w:r>
+        <w:t xml:space="preserve">快照，</w:t>
+      </w:r>
+      <w:r>
+        <w:rPr>
+          <w:bCs/>
+          <w:b/>
+        </w:rPr>
+        <w:t xml:space="preserve">不含程式碼變更</w:t>
+      </w:r>
+      <w:r>
+        <w:t xml:space="preserve">（腳本自身亦有警告）。</w:t>
+      </w:r>
+    </w:p>
+    <w:p>
+      <w:pPr>
+        <w:numPr>
+          <w:ilvl w:val="0"/>
+          <w:numId w:val="1021"/>
+        </w:numPr>
+        <w:pStyle w:val="Compact"/>
+      </w:pPr>
+      <w:r>
+        <w:t xml:space="preserve">新增</w:t>
+      </w:r>
+      <w:r>
+        <w:t xml:space="preserve"> </w:t>
+      </w:r>
+      <w:r>
+        <w:rPr>
+          <w:rStyle w:val="VerbatimChar"/>
+        </w:rPr>
+        <w:t xml:space="preserve">push_app.bat</w:t>
+      </w:r>
+      <w:r>
+        <w:t xml:space="preserve"> </w:t>
+      </w:r>
+      <w:r>
+        <w:t xml:space="preserve">專門處理程式碼：</w:t>
+      </w:r>
+      <w:r>
+        <w:rPr>
+          <w:rStyle w:val="VerbatimChar"/>
+        </w:rPr>
+        <w:t xml:space="preserve">git add app.py docs → commit → push</w:t>
+      </w:r>
+      <w:r>
+        <w:t xml:space="preserve">（自動判斷分支、無變更就跳過、push 失敗自動補</w:t>
+      </w:r>
+      <w:r>
+        <w:t xml:space="preserve"> </w:t>
+      </w:r>
+      <w:r>
+        <w:rPr>
+          <w:rStyle w:val="VerbatimChar"/>
+        </w:rPr>
+        <w:t xml:space="preserve">-u origin</w:t>
+      </w:r>
+      <w:r>
+        <w:t xml:space="preserve">），</w:t>
+      </w:r>
+      <w:r>
+        <w:t xml:space="preserve"> </w:t>
+      </w:r>
+      <w:r>
+        <w:t xml:space="preserve">讓使用說明 / 文件的改動能雙擊一鍵上線、觸發 Streamlit 自動重部署。</w:t>
+      </w:r>
+    </w:p>
+    <w:bookmarkEnd w:id="53"/>
+    <w:bookmarkStart w:id="54" w:name="X7d896dfa38bc12ba57f129a4cfde86cf0e0bc96"/>
+    <w:p>
+      <w:pPr>
+        <w:pStyle w:val="Heading3"/>
+      </w:pPr>
+      <w:r>
+        <w:t xml:space="preserve">C. 使用指南改版並輸出 Word（</w:t>
+      </w:r>
+      <w:r>
+        <w:rPr>
+          <w:rStyle w:val="VerbatimChar"/>
+        </w:rPr>
+        <w:t xml:space="preserve">docs/使用指南_USER_GUIDE.md</w:t>
+      </w:r>
+      <w:r>
+        <w:t xml:space="preserve"> </w:t>
+      </w:r>
+      <w:r>
+        <w:t xml:space="preserve">+</w:t>
+      </w:r>
+      <w:r>
+        <w:t xml:space="preserve"> </w:t>
+      </w:r>
+      <w:r>
+        <w:rPr>
+          <w:rStyle w:val="VerbatimChar"/>
+        </w:rPr>
+        <w:t xml:space="preserve">.docx</w:t>
+      </w:r>
+      <w:r>
+        <w:t xml:space="preserve">）</w:t>
+      </w:r>
+    </w:p>
+    <w:p>
+      <w:pPr>
+        <w:numPr>
+          <w:ilvl w:val="0"/>
+          <w:numId w:val="1022"/>
+        </w:numPr>
+        <w:pStyle w:val="Compact"/>
+      </w:pPr>
+      <w:r>
+        <w:t xml:space="preserve">指南同步補上第 3 節（FinMind token 取得）、第 4 節（API 用量與建議檔數）、第 8 節（綜合分選股 + 8-1 自選名單</w:t>
+      </w:r>
+      <w:r>
+        <w:t xml:space="preserve"> </w:t>
+      </w:r>
+      <w:r>
+        <w:rPr>
+          <w:rStyle w:val="VerbatimChar"/>
+        </w:rPr>
+        <w:t xml:space="preserve">watchlist.txt</w:t>
+      </w:r>
+      <w:r>
+        <w:t xml:space="preserve"> </w:t>
+      </w:r>
+      <w:r>
+        <w:t xml:space="preserve">控制），</w:t>
+      </w:r>
+      <w:r>
+        <w:t xml:space="preserve"> </w:t>
+      </w:r>
+      <w:r>
+        <w:t xml:space="preserve">章節重新編號，常見問題與指令速查一併更新；並以</w:t>
+      </w:r>
+      <w:r>
+        <w:t xml:space="preserve"> </w:t>
+      </w:r>
+      <w:r>
+        <w:rPr>
+          <w:bCs/>
+          <w:b/>
+        </w:rPr>
+        <w:t xml:space="preserve">pandoc</w:t>
+      </w:r>
+      <w:r>
+        <w:t xml:space="preserve"> </w:t>
+      </w:r>
+      <w:r>
+        <w:t xml:space="preserve">產出對應</w:t>
+      </w:r>
+      <w:r>
+        <w:t xml:space="preserve"> </w:t>
+      </w:r>
+      <w:r>
+        <w:rPr>
+          <w:bCs/>
+          <w:b/>
+        </w:rPr>
+        <w:t xml:space="preserve">Word（.docx）</w:t>
+      </w:r>
+      <w:r>
+        <w:t xml:space="preserve"> </w:t>
+      </w:r>
+      <w:r>
+        <w:t xml:space="preserve">版供列印 / 分享。</w:t>
+      </w:r>
+    </w:p>
+    <w:p>
+      <w:pPr>
+        <w:pStyle w:val="BlockText"/>
+      </w:pPr>
+      <w:r>
+        <w:rPr>
+          <w:bCs/>
+          <w:b/>
+        </w:rPr>
+        <w:t xml:space="preserve">此節點的意義</w:t>
+      </w:r>
+      <w:r>
+        <w:t xml:space="preserve">：v4.0 打通「能公開用」，v4.1 打通「能自己上手」——把作者腦中的隱性知識</w:t>
+      </w:r>
+      <w:r>
+        <w:t xml:space="preserve"> </w:t>
+      </w:r>
+      <w:r>
+        <w:t xml:space="preserve">（怎麼拿 token、額度怎麼算、名單誰控制、改完怎麼上線）全部寫進產品內建說明與指南，降低新使用者的上手門檻。</w:t>
+      </w:r>
+    </w:p>
+    <w:p>
+      <w:r>
+        <w:pict>
+          <v:rect style="width:0;height:1.5pt" o:hralign="center" o:hrstd="t" o:hr="t"/>
+        </w:pict>
+      </w:r>
+    </w:p>
+    <w:bookmarkEnd w:id="54"/>
+    <w:bookmarkEnd w:id="55"/>
+    <w:bookmarkStart w:id="56" w:name="X18d5a40128576ee9820ff8c3579b771c95d9c7b"/>
+    <w:p>
+      <w:pPr>
+        <w:pStyle w:val="Heading2"/>
+      </w:pPr>
+      <w:r>
+        <w:t xml:space="preserve">11. 📈 關鍵指標演進總表</w:t>
       </w:r>
     </w:p>
     <w:tbl>
@@ -7481,21 +8130,21 @@
         </w:pict>
       </w:r>
     </w:p>
-    <w:bookmarkEnd w:id="52"/>
-    <w:bookmarkStart w:id="53" w:name="Xd32ff49cbee2cf28b41dd7519abdc35e48b8c1a"/>
+    <w:bookmarkEnd w:id="56"/>
+    <w:bookmarkStart w:id="57" w:name="Xab4794422d134a2f38c85077f9534c871ee3377"/>
     <w:p>
       <w:pPr>
         <w:pStyle w:val="Heading2"/>
       </w:pPr>
       <w:r>
-        <w:t xml:space="preserve">11. 🔮 未來優化藍圖 (Next Steps)</w:t>
+        <w:t xml:space="preserve">12. 🔮 未來優化藍圖 (Next Steps)</w:t>
       </w:r>
     </w:p>
     <w:p>
       <w:pPr>
         <w:numPr>
           <w:ilvl w:val="0"/>
-          <w:numId w:val="1020"/>
+          <w:numId w:val="1023"/>
         </w:numPr>
         <w:pStyle w:val="Compact"/>
       </w:pPr>
@@ -7566,7 +8215,7 @@
       <w:pPr>
         <w:numPr>
           <w:ilvl w:val="0"/>
-          <w:numId w:val="1020"/>
+          <w:numId w:val="1023"/>
         </w:numPr>
         <w:pStyle w:val="Compact"/>
       </w:pPr>
@@ -7621,7 +8270,7 @@
       <w:pPr>
         <w:numPr>
           <w:ilvl w:val="0"/>
-          <w:numId w:val="1020"/>
+          <w:numId w:val="1023"/>
         </w:numPr>
         <w:pStyle w:val="Compact"/>
       </w:pPr>
@@ -7683,7 +8332,7 @@
       <w:pPr>
         <w:numPr>
           <w:ilvl w:val="0"/>
-          <w:numId w:val="1020"/>
+          <w:numId w:val="1023"/>
         </w:numPr>
         <w:pStyle w:val="Compact"/>
       </w:pPr>
@@ -7712,7 +8361,7 @@
       <w:pPr>
         <w:numPr>
           <w:ilvl w:val="0"/>
-          <w:numId w:val="1020"/>
+          <w:numId w:val="1023"/>
         </w:numPr>
         <w:pStyle w:val="Compact"/>
       </w:pPr>
@@ -7746,7 +8395,7 @@
       <w:pPr>
         <w:numPr>
           <w:ilvl w:val="0"/>
-          <w:numId w:val="1020"/>
+          <w:numId w:val="1023"/>
         </w:numPr>
         <w:pStyle w:val="Compact"/>
       </w:pPr>
@@ -7795,7 +8444,7 @@
       <w:pPr>
         <w:numPr>
           <w:ilvl w:val="0"/>
-          <w:numId w:val="1020"/>
+          <w:numId w:val="1023"/>
         </w:numPr>
         <w:pStyle w:val="Compact"/>
       </w:pPr>
@@ -7817,17 +8466,17 @@
         </w:pict>
       </w:r>
     </w:p>
-    <w:bookmarkEnd w:id="53"/>
-    <w:bookmarkStart w:id="58" w:name="X26866916ce29e77f52c19cbea02ecf7c8ee51fb"/>
+    <w:bookmarkEnd w:id="57"/>
+    <w:bookmarkStart w:id="62" w:name="X9785cd63c1be2ad500c0f8d5dc148f70f0dfead"/>
     <w:p>
       <w:pPr>
         <w:pStyle w:val="Heading2"/>
       </w:pPr>
       <w:r>
-        <w:t xml:space="preserve">12. 🧰 附錄：使用指南、調參入口與檔案地圖</w:t>
-      </w:r>
-    </w:p>
-    <w:bookmarkStart w:id="54" w:name="X68a71c6cb4ce842ac3189a608d74eba100cc155"/>
+        <w:t xml:space="preserve">13. 🧰 附錄：使用指南、調參入口與檔案地圖</w:t>
+      </w:r>
+    </w:p>
+    <w:bookmarkStart w:id="58" w:name="X68a71c6cb4ce842ac3189a608d74eba100cc155"/>
     <w:p>
       <w:pPr>
         <w:pStyle w:val="Heading3"/>
@@ -8075,8 +8724,8 @@
         <w:t xml:space="preserve">#    之後更新雲端：雙擊 update_and_push.bat（同步 scores 快照 → commit → push）</w:t>
       </w:r>
     </w:p>
-    <w:bookmarkEnd w:id="54"/>
-    <w:bookmarkStart w:id="55" w:name="主要調參入口"/>
+    <w:bookmarkEnd w:id="58"/>
+    <w:bookmarkStart w:id="59" w:name="主要調參入口"/>
     <w:p>
       <w:pPr>
         <w:pStyle w:val="Heading3"/>
@@ -8404,8 +9053,8 @@
         </w:tc>
       </w:tr>
     </w:tbl>
-    <w:bookmarkEnd w:id="55"/>
-    <w:bookmarkStart w:id="56" w:name="回測與選股指令速查"/>
+    <w:bookmarkEnd w:id="59"/>
+    <w:bookmarkStart w:id="60" w:name="回測與選股指令速查"/>
     <w:p>
       <w:pPr>
         <w:pStyle w:val="Heading3"/>
@@ -8787,8 +9436,8 @@
         </w:tc>
       </w:tr>
     </w:tbl>
-    <w:bookmarkEnd w:id="56"/>
-    <w:bookmarkStart w:id="57" w:name="核心檔案"/>
+    <w:bookmarkEnd w:id="60"/>
+    <w:bookmarkStart w:id="61" w:name="核心檔案"/>
     <w:p>
       <w:pPr>
         <w:pStyle w:val="Heading3"/>
@@ -8801,7 +9450,7 @@
       <w:pPr>
         <w:numPr>
           <w:ilvl w:val="0"/>
-          <w:numId w:val="1021"/>
+          <w:numId w:val="1024"/>
         </w:numPr>
         <w:pStyle w:val="Compact"/>
       </w:pPr>
@@ -8853,7 +9502,7 @@
       <w:pPr>
         <w:numPr>
           <w:ilvl w:val="0"/>
-          <w:numId w:val="1021"/>
+          <w:numId w:val="1024"/>
         </w:numPr>
         <w:pStyle w:val="Compact"/>
       </w:pPr>
@@ -8899,7 +9548,7 @@
       <w:pPr>
         <w:numPr>
           <w:ilvl w:val="0"/>
-          <w:numId w:val="1021"/>
+          <w:numId w:val="1024"/>
         </w:numPr>
         <w:pStyle w:val="Compact"/>
       </w:pPr>
@@ -8945,7 +9594,7 @@
       <w:pPr>
         <w:numPr>
           <w:ilvl w:val="0"/>
-          <w:numId w:val="1021"/>
+          <w:numId w:val="1024"/>
         </w:numPr>
         <w:pStyle w:val="Compact"/>
       </w:pPr>
@@ -9039,6 +9688,67 @@
       </w:r>
       <w:r>
         <w:t xml:space="preserve">（雲端快照）</w:t>
+      </w:r>
+    </w:p>
+    <w:p>
+      <w:pPr>
+        <w:numPr>
+          <w:ilvl w:val="0"/>
+          <w:numId w:val="1024"/>
+        </w:numPr>
+        <w:pStyle w:val="Compact"/>
+      </w:pPr>
+      <w:r>
+        <w:rPr>
+          <w:bCs/>
+          <w:b/>
+        </w:rPr>
+        <w:t xml:space="preserve">文件 / 上手（v4.1）</w:t>
+      </w:r>
+      <w:r>
+        <w:t xml:space="preserve">：</w:t>
+      </w:r>
+      <w:r>
+        <w:rPr>
+          <w:rStyle w:val="VerbatimChar"/>
+        </w:rPr>
+        <w:t xml:space="preserve">docs/使用指南_USER_GUIDE.md</w:t>
+      </w:r>
+      <w:r>
+        <w:t xml:space="preserve">（+</w:t>
+      </w:r>
+      <w:r>
+        <w:t xml:space="preserve"> </w:t>
+      </w:r>
+      <w:r>
+        <w:rPr>
+          <w:rStyle w:val="VerbatimChar"/>
+        </w:rPr>
+        <w:t xml:space="preserve">.docx</w:t>
+      </w:r>
+      <w:r>
+        <w:t xml:space="preserve">）、</w:t>
+      </w:r>
+      <w:r>
+        <w:rPr>
+          <w:rStyle w:val="VerbatimChar"/>
+        </w:rPr>
+        <w:t xml:space="preserve">app.py</w:t>
+      </w:r>
+      <w:r>
+        <w:t xml:space="preserve"> </w:t>
+      </w:r>
+      <w:r>
+        <w:t xml:space="preserve">內建「📖 使用說明」分頁、</w:t>
+      </w:r>
+      <w:r>
+        <w:rPr>
+          <w:rStyle w:val="VerbatimChar"/>
+        </w:rPr>
+        <w:t xml:space="preserve">push_app.bat</w:t>
+      </w:r>
+      <w:r>
+        <w:t xml:space="preserve">（一鍵推程式碼與文件）</w:t>
       </w:r>
     </w:p>
     <w:p>
@@ -9057,7 +9767,7 @@
           <w:iCs/>
           <w:i/>
         </w:rPr>
-        <w:t xml:space="preserve">本日誌記錄從「防守型 3 級反向指標」到「四級雙軌 + 市場中性驗證通過」，再到 v4.0「快取層 + 跨股綜合分選股 + 網頁化公開上線」的完整歷程。</w:t>
+        <w:t xml:space="preserve">本日誌記錄從「防守型 3 級反向指標」到「四級雙軌 + 市場中性驗證通過」，再到 v4.0「快取層 + 跨股綜合分選股 + 網頁化公開上線」、v4.1「上手文件與使用說明強化」的完整歷程。</w:t>
       </w:r>
       <w:r>
         <w:t xml:space="preserve"> </w:t>
@@ -9070,9 +9780,9 @@
         <w:t xml:space="preserve">核心成果：三大痛點（恐高／逆勢／死抱）已解，選股排序力經樣本外驗證，定案風險調整後勝過大盤的配置；並將排序力物化為可跨股查詢、可網頁選股、可公開部署的系統。</w:t>
       </w:r>
     </w:p>
-    <w:bookmarkEnd w:id="57"/>
-    <w:bookmarkEnd w:id="58"/>
-    <w:bookmarkEnd w:id="59"/>
+    <w:bookmarkEnd w:id="61"/>
+    <w:bookmarkEnd w:id="62"/>
+    <w:bookmarkEnd w:id="63"/>
     <w:sectPr/>
   </w:body>
 </w:document>
@@ -9482,6 +10192,15 @@
     <w:abstractNumId w:val="991"/>
   </w:num>
   <w:num w:numId="1020">
+    <w:abstractNumId w:val="991"/>
+  </w:num>
+  <w:num w:numId="1021">
+    <w:abstractNumId w:val="991"/>
+  </w:num>
+  <w:num w:numId="1022">
+    <w:abstractNumId w:val="991"/>
+  </w:num>
+  <w:num w:numId="1023">
     <w:abstractNumId w:val="99411"/>
     <w:lvlOverride w:ilvl="0">
       <w:startOverride w:val="1"/>
@@ -9511,7 +10230,7 @@
       <w:startOverride w:val="1"/>
     </w:lvlOverride>
   </w:num>
-  <w:num w:numId="1021">
+  <w:num w:numId="1024">
     <w:abstractNumId w:val="991"/>
   </w:num>
 </w:numbering>

</xml_diff>